<commit_message>
Restructure site: 40 pages per language with redirects, case-study centrepiece, contextual CTAs, entry-point home, AI Act date correction, monthly outage note
Co-Authored-By: Claude Sonnet 5.5 <noreply@anthropic.com>
Claude-Session: https://claude.ai/code/session_019U8r2gsJdmaE1enLWWwWXU
</commit_message>
<xml_diff>
--- a/assets/downloads/ai-agent-audit-scorecard-en.docx
+++ b/assets/downloads/ai-agent-audit-scorecard-en.docx
@@ -31,7 +31,7 @@
     </w:p>
     <w:p>
       <w:r>
-        <w:t>Fill in one row per deployed agent or automation. Back every column with evidence (logs, traces, invoices, reviewed samples) rather than the design document. The ratings below are an example: adapt the thresholds to your risk tolerance. Re-run the table every quarter and whenever a model, prompt or permission changes.</w:t>
+        <w:t>Fill in one row per deployed agent or automation. Back every column with evidence (logs, traces, invoices, reviewed samples) rather than the design document. The ratings below are an example grid: adapt the thresholds to your risk tolerance. Re-run the table every quarter and whenever a model, prompt or permission changes, then compare with the previous cycle.</w:t>
       </w:r>
     </w:p>
     <w:p>
@@ -50,7 +50,7 @@
         <w:t xml:space="preserve">Low — </w:t>
       </w:r>
       <w:r>
-        <w:t>Reversible errors, few cases touched, detection the same day.</w:t>
+        <w:t>Reversible errors, few cases touched, fast detection: a person notices the same day.</w:t>
       </w:r>
     </w:p>
     <w:p>
@@ -83,7 +83,7 @@
         <w:t xml:space="preserve">Critical — </w:t>
       </w:r>
       <w:r>
-        <w:t>Irreversible errors, or errors affecting safety, large sums or compliance, at high volume, with uncertain detection. Requires human approval, staged rollout and a tested kill switch.</w:t>
+        <w:t>Irreversible errors, or errors touching safety, large sums or compliance, at high volume, with uncertain detection. Requires human approval, staged rollout and a tested kill switch.</w:t>
       </w:r>
     </w:p>
     <w:p>
@@ -188,7 +188,7 @@
                 <w:b/>
                 <w:sz w:val="17"/>
               </w:rPr>
-              <w:t>Monthly cost</w:t>
+              <w:t>Monthly cost to run</w:t>
             </w:r>
           </w:p>
         </w:tc>
@@ -218,7 +218,7 @@
                 <w:b/>
                 <w:sz w:val="17"/>
               </w:rPr>
-              <w:t>Accuracy vs human baseline</w:t>
+              <w:t>Accuracy (sample) vs human baseline</w:t>
             </w:r>
           </w:p>
         </w:tc>
@@ -415,7 +415,7 @@
                 <w:color w:val="56656F"/>
                 <w:sz w:val="17"/>
               </w:rPr>
-              <w:t>Medium · partly irreversible</w:t>
+              <w:t>Medium · partly irreversible (email sent)</w:t>
             </w:r>
           </w:p>
         </w:tc>
@@ -460,7 +460,7 @@
                 <w:color w:val="56656F"/>
                 <w:sz w:val="17"/>
               </w:rPr>
-              <w:t>No approval before sending or tested kill switch</w:t>
+              <w:t>No approval before sending; no tested kill switch</w:t>
             </w:r>
           </w:p>
         </w:tc>
@@ -475,7 +475,7 @@
                 <w:color w:val="56656F"/>
                 <w:sz w:val="17"/>
               </w:rPr>
-              <w:t>In 3 months or at next change</w:t>
+              <w:t>In 3 months or at the next model change</w:t>
             </w:r>
           </w:p>
         </w:tc>
@@ -1397,7 +1397,7 @@
         <w:t xml:space="preserve">Start with the inventory. </w:t>
       </w:r>
       <w:r>
-        <w:t>Include agents teams adopted without going through IT.</w:t>
+        <w:t>You cannot audit what you do not know. Include agents teams adopted without going through IT.</w:t>
       </w:r>
     </w:p>
     <w:p>
@@ -1408,10 +1408,10 @@
         <w:rPr>
           <w:b/>
         </w:rPr>
-        <w:t xml:space="preserve">Measure value. </w:t>
+        <w:t xml:space="preserve">Measure value, don't assume it. </w:t>
       </w:r>
       <w:r>
-        <w:t>Replace estimates with real costs and a hand-reviewed sample.</w:t>
+        <w:t>Replace the business-case estimate with real costs and a hand-reviewed sample.</w:t>
       </w:r>
     </w:p>
     <w:p>
@@ -1425,7 +1425,7 @@
         <w:t xml:space="preserve">Rate the worst case. </w:t>
       </w:r>
       <w:r>
-        <w:t>Rate blast radius by what can go wrong at real volume, not by the average.</w:t>
+        <w:t>Blast radius is judged on what can go wrong, at real volume, before a human notices, not on the average.</w:t>
       </w:r>
     </w:p>
     <w:p>
@@ -1439,7 +1439,7 @@
         <w:t xml:space="preserve">Match controls to the rating. </w:t>
       </w:r>
       <w:r>
-        <w:t>Record the gap between existing controls and those the rating requires.</w:t>
+        <w:t>A critical rating requires more than an occasional review. Record the gap between existing controls and those the rating demands.</w:t>
       </w:r>
     </w:p>
     <w:sectPr>

</xml_diff>